<commit_message>
Embed figures in PRD v2.0 (Word)
</commit_message>
<xml_diff>
--- a/docs/PRD-v2.0.docx
+++ b/docs/PRD-v2.0.docx
@@ -1233,7 +1233,48 @@
     </w:p>
     <w:p>
       <w:pPr>
-        <w:spacing w:after="160"/>
+        <w:spacing w:before="120" w:after="40"/>
+        <w:jc w:val="center"/>
+      </w:pPr>
+      <w:r>
+        <w:drawing>
+          <wp:inline xmlns:a="http://schemas.openxmlformats.org/drawingml/2006/main" xmlns:pic="http://schemas.openxmlformats.org/drawingml/2006/picture">
+            <wp:extent cx="3240000" cy="3600000"/>
+            <wp:docPr id="1" name="Picture 1"/>
+            <wp:cNvGraphicFramePr>
+              <a:graphicFrameLocks noChangeAspect="1"/>
+            </wp:cNvGraphicFramePr>
+            <a:graphic>
+              <a:graphicData uri="http://schemas.openxmlformats.org/drawingml/2006/picture">
+                <pic:pic>
+                  <pic:nvPicPr>
+                    <pic:cNvPr id="0" name="screenshot.png"/>
+                    <pic:cNvPicPr/>
+                  </pic:nvPicPr>
+                  <pic:blipFill>
+                    <a:blip r:embed="rId10"/>
+                    <a:stretch>
+                      <a:fillRect/>
+                    </a:stretch>
+                  </pic:blipFill>
+                  <pic:spPr>
+                    <a:xfrm>
+                      <a:off x="0" y="0"/>
+                      <a:ext cx="3240000" cy="3600000"/>
+                    </a:xfrm>
+                    <a:prstGeom prst="rect"/>
+                  </pic:spPr>
+                </pic:pic>
+              </a:graphicData>
+            </a:graphic>
+          </wp:inline>
+        </w:drawing>
+      </w:r>
+    </w:p>
+    <w:p>
+      <w:pPr>
+        <w:spacing w:after="200"/>
+        <w:jc w:val="center"/>
       </w:pPr>
       <w:r>
         <w:rPr>
@@ -1241,7 +1282,7 @@
           <w:color w:val="6E6478"/>
           <w:sz w:val="15"/>
         </w:rPr>
-        <w:t>图 1 · 当前开始界面：底部渐变遮罩让棋盘与蛇可见，文案沉底，只有一个 CTA。</w:t>
+        <w:t>图 1 · 当前游戏界面（Playing 态）：渐变蛇身、带眼睛的蛇头、发光苹果、金色碎片倒计时环。</w:t>
       </w:r>
     </w:p>
     <w:p>
@@ -7032,6 +7073,60 @@
     </w:p>
     <w:p>
       <w:pPr>
+        <w:spacing w:before="120" w:after="40"/>
+        <w:jc w:val="center"/>
+      </w:pPr>
+      <w:r>
+        <w:drawing>
+          <wp:inline xmlns:a="http://schemas.openxmlformats.org/drawingml/2006/main" xmlns:pic="http://schemas.openxmlformats.org/drawingml/2006/picture">
+            <wp:extent cx="5580000" cy="2859750"/>
+            <wp:docPr id="2" name="Picture 2"/>
+            <wp:cNvGraphicFramePr>
+              <a:graphicFrameLocks noChangeAspect="1"/>
+            </wp:cNvGraphicFramePr>
+            <a:graphic>
+              <a:graphicData uri="http://schemas.openxmlformats.org/drawingml/2006/picture">
+                <pic:pic>
+                  <pic:nvPicPr>
+                    <pic:cNvPr id="0" name="fig-states.png"/>
+                    <pic:cNvPicPr/>
+                  </pic:nvPicPr>
+                  <pic:blipFill>
+                    <a:blip r:embed="rId11"/>
+                    <a:stretch>
+                      <a:fillRect/>
+                    </a:stretch>
+                  </pic:blipFill>
+                  <pic:spPr>
+                    <a:xfrm>
+                      <a:off x="0" y="0"/>
+                      <a:ext cx="5580000" cy="2859750"/>
+                    </a:xfrm>
+                    <a:prstGeom prst="rect"/>
+                  </pic:spPr>
+                </pic:pic>
+              </a:graphicData>
+            </a:graphic>
+          </wp:inline>
+        </w:drawing>
+      </w:r>
+    </w:p>
+    <w:p>
+      <w:pPr>
+        <w:spacing w:after="200"/>
+        <w:jc w:val="center"/>
+      </w:pPr>
+      <w:r>
+        <w:rPr>
+          <w:rFonts w:ascii="Microsoft YaHei" w:hAnsi="Microsoft YaHei" w:eastAsia="Microsoft YaHei" w:cs="Microsoft YaHei"/>
+          <w:color w:val="6E6478"/>
+          <w:sz w:val="15"/>
+        </w:rPr>
+        <w:t>图 2 · 四个状态与全部合法转移；任何转移都必须有可见反馈，切后台不得导致死亡。</w:t>
+      </w:r>
+    </w:p>
+    <w:p>
+      <w:pPr>
         <w:spacing w:before="240" w:after="80"/>
         <w:pBdr>
           <w:bottom w:val="single" w:sz="6" w:space="4" w:color="F3D6DE"/>
@@ -10602,6 +10697,60 @@
     </w:p>
     <w:p>
       <w:pPr>
+        <w:spacing w:before="120" w:after="40"/>
+        <w:jc w:val="center"/>
+      </w:pPr>
+      <w:r>
+        <w:drawing>
+          <wp:inline xmlns:a="http://schemas.openxmlformats.org/drawingml/2006/main" xmlns:pic="http://schemas.openxmlformats.org/drawingml/2006/picture">
+            <wp:extent cx="5580000" cy="3138750"/>
+            <wp:docPr id="3" name="Picture 3"/>
+            <wp:cNvGraphicFramePr>
+              <a:graphicFrameLocks noChangeAspect="1"/>
+            </wp:cNvGraphicFramePr>
+            <a:graphic>
+              <a:graphicData uri="http://schemas.openxmlformats.org/drawingml/2006/picture">
+                <pic:pic>
+                  <pic:nvPicPr>
+                    <pic:cNvPr id="0" name="fig-difficulty.png"/>
+                    <pic:cNvPicPr/>
+                  </pic:nvPicPr>
+                  <pic:blipFill>
+                    <a:blip r:embed="rId12"/>
+                    <a:stretch>
+                      <a:fillRect/>
+                    </a:stretch>
+                  </pic:blipFill>
+                  <pic:spPr>
+                    <a:xfrm>
+                      <a:off x="0" y="0"/>
+                      <a:ext cx="5580000" cy="3138750"/>
+                    </a:xfrm>
+                    <a:prstGeom prst="rect"/>
+                  </pic:spPr>
+                </pic:pic>
+              </a:graphicData>
+            </a:graphic>
+          </wp:inline>
+        </w:drawing>
+      </w:r>
+    </w:p>
+    <w:p>
+      <w:pPr>
+        <w:spacing w:after="200"/>
+        <w:jc w:val="center"/>
+      </w:pPr>
+      <w:r>
+        <w:rPr>
+          <w:rFonts w:ascii="Microsoft YaHei" w:hAnsi="Microsoft YaHei" w:eastAsia="Microsoft YaHei" w:cs="Microsoft YaHei"/>
+          <w:color w:val="6E6478"/>
+          <w:sz w:val="15"/>
+        </w:rPr>
+        <w:t>图 3 · 难度曲线：7.1 格/秒起步，随身长线性收紧，26 格后封顶 16.1 格/秒。</w:t>
+      </w:r>
+    </w:p>
+    <w:p>
+      <w:pPr>
         <w:spacing w:before="240" w:after="80"/>
         <w:pBdr>
           <w:bottom w:val="single" w:sz="6" w:space="4" w:color="F3D6DE"/>
@@ -12658,19 +12807,6 @@
           <w:sz w:val="20"/>
         </w:rPr>
         <w:t>README 与主页使用 docs/screenshot.png（900×1000），走 jsDelivr 分发。分享卡（1200×630）为 P1 计划，必须在小缩略图下仍可读出分数、游戏名与链接。</w:t>
-      </w:r>
-    </w:p>
-    <w:p>
-      <w:pPr>
-        <w:spacing w:after="160"/>
-      </w:pPr>
-      <w:r>
-        <w:rPr>
-          <w:rFonts w:ascii="Microsoft YaHei" w:hAnsi="Microsoft YaHei" w:eastAsia="Microsoft YaHei" w:cs="Microsoft YaHei"/>
-          <w:color w:val="6E6478"/>
-          <w:sz w:val="15"/>
-        </w:rPr>
-        <w:t>图 2 · 当前游戏界面：渐变蛇身、带眼睛的蛇头、发光苹果、金色碎片倒计时环。</w:t>
       </w:r>
     </w:p>
     <w:p>

</xml_diff>